<commit_message>
Speaker Agreement: add vendor neutrality and respectful participation
Vendors: no disparagement, no promotion, and a narrow allowance for
describing a tool as the speaker's own practice choice or answering a
direct question briefly. Adds advance disclosure of any sponsorship,
referral, ownership, or compensation.

Respectful participation references NACBA's DEI policy. The policy
itself is not in hand, so its location is a marked placeholder that
must be filled before the agreement goes to any speaker.

Co-Authored-By: Claude Opus 5 <noreply@anthropic.com>
</commit_message>
<xml_diff>
--- a/templates/1. Speaker Packet - Requirements & Deadlines.docx
+++ b/templates/1. Speaker Packet - Requirements & Deadlines.docx
@@ -926,6 +926,93 @@
           <w:szCs w:val="22"/>
         </w:rPr>
         <w:t xml:space="preserve">If any of your material comes from a copyrighted publication, tell your coordinator early. NACBA must obtain written permission to reprint, and that takes time.</w:t>
+      </w:r>
+    </w:p>
+    <w:p>
+      <w:pPr>
+        <w:spacing w:after="140" w:before="340"/>
+      </w:pPr>
+      <w:r>
+        <w:rPr>
+          <w:rFonts w:ascii="Calibri" w:cs="Calibri" w:eastAsia="Calibri" w:hAnsi="Calibri"/>
+          <w:b/>
+          <w:bCs/>
+          <w:color w:val="0B243A"/>
+          <w:sz w:val="26"/>
+          <w:szCs w:val="26"/>
+        </w:rPr>
+        <w:t xml:space="preserve">Program neutrality and conduct</w:t>
+      </w:r>
+    </w:p>
+    <w:p>
+      <w:pPr>
+        <w:spacing w:after="140"/>
+      </w:pPr>
+      <w:r>
+        <w:rPr>
+          <w:rFonts w:ascii="Calibri" w:cs="Calibri" w:eastAsia="Calibri" w:hAnsi="Calibri"/>
+          <w:color w:val="1A1A1A"/>
+          <w:sz w:val="22"/>
+          <w:szCs w:val="22"/>
+        </w:rPr>
+        <w:t xml:space="preserve">Two commitments in the Speaker Agreement are worth knowing before you start writing, because they shape your materials:</w:t>
+      </w:r>
+    </w:p>
+    <w:p>
+      <w:pPr>
+        <w:pStyle w:val="ListParagraph"/>
+        <w:numPr>
+          <w:ilvl w:val="0"/>
+          <w:numId w:val="2"/>
+        </w:numPr>
+        <w:spacing w:after="90"/>
+      </w:pPr>
+      <w:r>
+        <w:rPr>
+          <w:rFonts w:ascii="Calibri" w:cs="Calibri" w:eastAsia="Calibri" w:hAnsi="Calibri"/>
+          <w:color w:val="1A1A1A"/>
+          <w:sz w:val="22"/>
+          <w:szCs w:val="22"/>
+        </w:rPr>
+        <w:t xml:space="preserve">NACBA programs are educational, not promotional. Please do not disparage or endorse any vendor, product, or service. If a tool is relevant, describe it as your own practice choice — and if an attendee asks what you use, answer briefly and move on.</w:t>
+      </w:r>
+    </w:p>
+    <w:p>
+      <w:pPr>
+        <w:pStyle w:val="ListParagraph"/>
+        <w:numPr>
+          <w:ilvl w:val="0"/>
+          <w:numId w:val="2"/>
+        </w:numPr>
+        <w:spacing w:after="90"/>
+      </w:pPr>
+      <w:r>
+        <w:rPr>
+          <w:rFonts w:ascii="Calibri" w:cs="Calibri" w:eastAsia="Calibri" w:hAnsi="Calibri"/>
+          <w:color w:val="1A1A1A"/>
+          <w:sz w:val="22"/>
+          <w:szCs w:val="22"/>
+        </w:rPr>
+        <w:t xml:space="preserve">NACBA has a Diversity, Equity, and Inclusion Policy, and speakers agree to conduct themselves consistently with it. In practice this means respectful treatment of everyone in the room, inclusive examples and humor, and language about debtors that does not stigmatize them for seeking relief the law provides.</w:t>
+      </w:r>
+    </w:p>
+    <w:p>
+      <w:pPr>
+        <w:pStyle w:val="ListParagraph"/>
+        <w:numPr>
+          <w:ilvl w:val="0"/>
+          <w:numId w:val="2"/>
+        </w:numPr>
+        <w:spacing w:after="90"/>
+      </w:pPr>
+      <w:r>
+        <w:rPr>
+          <w:rFonts w:ascii="Calibri" w:cs="Calibri" w:eastAsia="Calibri" w:hAnsi="Calibri"/>
+          <w:color w:val="1A1A1A"/>
+          <w:sz w:val="22"/>
+          <w:szCs w:val="22"/>
+        </w:rPr>
+        <w:t xml:space="preserve">If you have a sponsorship, referral arrangement, ownership interest, or any compensation from a vendor you expect to mention, disclose it to NACBA in advance.</w:t>
       </w:r>
     </w:p>
     <w:p>

</xml_diff>